<commit_message>
Docs: privacy policy matches the implemented retention (30 days coordinates, daily purge, anonymization); Word files regenerated
Co-Authored-By: Claude Sonnet 5.5 <noreply@anthropic.com>
Claude-Session: https://claude.ai/code/session_01GvNCdmbjqJbdwgpjRN1wEQ
</commit_message>
<xml_diff>
--- a/docs/legal/print/Privacy-Policy-DRAFT-Timekeeper-Work.docx
+++ b/docs/legal/print/Privacy-Policy-DRAFT-Timekeeper-Work.docx
@@ -430,7 +430,7 @@
               <w:rPr>
                 <w:sz w:val="19"/>
               </w:rPr>
-              <w:t xml:space="preserve">With each event; the exact coordinates are erased after [30 days] (section 5)</w:t>
+              <w:t xml:space="preserve">With each event; the exact coordinates are erased after 30 days (section 5)</w:t>
             </w:r>
           </w:p>
         </w:tc>
@@ -1093,7 +1093,7 @@
               <w:rPr>
                 <w:sz w:val="19"/>
               </w:rPr>
-              <w:t xml:space="preserve">[30 days]; afterwards only the workplace-level event stays</w:t>
+              <w:t xml:space="preserve">30 days; afterwards only the workplace-level event stays</w:t>
             </w:r>
           </w:p>
         </w:tc>
@@ -1110,22 +1110,22 @@
               <w:rPr>
                 <w:sz w:val="19"/>
               </w:rPr>
-              <w:t xml:space="preserve">App status / heartbeat records</w:t>
-            </w:r>
-          </w:p>
-        </w:tc>
-        <w:tc>
-          <w:tcPr/>
-          <w:p>
-            <w:pPr>
-              <w:pStyle w:val="Compact"/>
-              <w:jc w:val="left"/>
-            </w:pPr>
-            <w:r>
-              <w:rPr>
-                <w:sz w:val="19"/>
-              </w:rPr>
-              <w:t xml:space="preserve">[90 days]</w:t>
+              <w:t xml:space="preserve">App status</w:t>
+            </w:r>
+          </w:p>
+        </w:tc>
+        <w:tc>
+          <w:tcPr/>
+          <w:p>
+            <w:pPr>
+              <w:pStyle w:val="Compact"/>
+              <w:jc w:val="left"/>
+            </w:pPr>
+            <w:r>
+              <w:rPr>
+                <w:sz w:val="19"/>
+              </w:rPr>
+              <w:t xml:space="preserve">only the time the app was last active is kept (no history)</w:t>
             </w:r>
           </w:p>
         </w:tc>
@@ -1157,7 +1157,7 @@
               <w:rPr>
                 <w:sz w:val="19"/>
               </w:rPr>
-              <w:t xml:space="preserve">at least 12 months</w:t>
+              <w:t xml:space="preserve">24 months</w:t>
             </w:r>
           </w:p>
         </w:tc>
@@ -1203,7 +1203,7 @@
         <w:rPr>
           <w:rFonts w:ascii="Arial" w:hAnsi="Arial"/>
         </w:rPr>
-        <w:t xml:space="preserve">After these periods the data is deleted or anonymized automatically. Backups are encrypted and expire by the same schedule.</w:t>
+        <w:t xml:space="preserve">After these periods the data is deleted automatically (a daily job). Backups are encrypted and kept for [14 days], so a deleted record can remain in a backup for up to that long. On request, HR can irreversibly anonymize the record of an employee who has left (name, code, titles, login and device details are replaced; the daily attendance totals and the signed consent record remain).</w:t>
       </w:r>
     </w:p>
     <w:bookmarkEnd w:id="24"/>
@@ -1893,7 +1893,39 @@
         <w:rPr>
           <w:rFonts w:ascii="Arial" w:hAnsi="Arial"/>
         </w:rPr>
-        <w:t xml:space="preserve">☐ Confirm that what the policy says is true in the product: erasure of coordinates after 30 days, 90-day heartbeat retention, anonymization jobs, backups expiry. Remove or reword anything not yet built.</w:t>
+        <w:t xml:space="preserve">☒ Retention in the product matches this text (coordinates 30 days, attendance and audit deletion jobs, anonymization action; checked in code and tests). Re-check if the periods change (</w:t>
+      </w:r>
+      <w:r>
+        <w:rPr>
+          <w:rStyle w:val="VerbatimChar"/>
+          <w:rFonts w:ascii="Arial" w:hAnsi="Arial"/>
+        </w:rPr>
+        <w:t xml:space="preserve">ATTENDANCE_RETENTION_DAYS</w:t>
+      </w:r>
+      <w:r>
+        <w:rPr>
+          <w:rFonts w:ascii="Arial" w:hAnsi="Arial"/>
+        </w:rPr>
+        <w:t xml:space="preserve">,</w:t>
+      </w:r>
+      <w:r>
+        <w:rPr>
+          <w:rFonts w:ascii="Arial" w:hAnsi="Arial"/>
+        </w:rPr>
+        <w:t xml:space="preserve"> </w:t>
+      </w:r>
+      <w:r>
+        <w:rPr>
+          <w:rStyle w:val="VerbatimChar"/>
+          <w:rFonts w:ascii="Arial" w:hAnsi="Arial"/>
+        </w:rPr>
+        <w:t xml:space="preserve">AUDIT_RETENTION_DAYS</w:t>
+      </w:r>
+      <w:r>
+        <w:rPr>
+          <w:rFonts w:ascii="Arial" w:hAnsi="Arial"/>
+        </w:rPr>
+        <w:t xml:space="preserve">) and confirm the backup period on the real server.</w:t>
       </w:r>
     </w:p>
     <w:p>

</xml_diff>